<commit_message>
Auto sync: Dữ liệu Giá H1 + Macro mới
</commit_message>
<xml_diff>
--- a/Daily Reports/06_10_2026-CBOT Reports.docx
+++ b/Daily Reports/06_10_2026-CBOT Reports.docx
@@ -104,7 +104,7 @@
           <w:color w:val="5C768D"/>
           <w:sz w:val="19"/>
         </w:rPr>
-        <w:t>Cập nhật tự động qua `macro_tracker.py` vào lúc 06:16 ICT ngày 06/10/2026</w:t>
+        <w:t>Cập nhật tự động qua `macro_tracker.py` vào lúc 06:34 ICT ngày 06/10/2026</w:t>
       </w:r>
     </w:p>
     <w:tbl>
@@ -313,7 +313,7 @@
               <w:rPr>
                 <w:b/>
               </w:rPr>
-              <w:t>100.96 / thùng</w:t>
+              <w:t>100.26 / thùng</w:t>
             </w:r>
           </w:p>
         </w:tc>
@@ -442,7 +442,7 @@
               <w:rPr>
                 <w:b/>
               </w:rPr>
-              <w:t>102.22</w:t>
+              <w:t>102.10</w:t>
             </w:r>
           </w:p>
         </w:tc>
@@ -1218,7 +1218,7 @@
         <w:rPr>
           <w:b/>
         </w:rPr>
-        <w:t>`100.96` (+0.00%)</w:t>
+        <w:t>`100.26` (+0.00%)</w:t>
       </w:r>
       <w:r>
         <w:t xml:space="preserve"> | DXY: </w:t>
@@ -1227,7 +1227,7 @@
         <w:rPr>
           <w:b/>
         </w:rPr>
-        <w:t>`102.22` (+0.00%)</w:t>
+        <w:t>`102.10` (+0.00%)</w:t>
       </w:r>
       <w:r>
         <w:t xml:space="preserve"> | Lúa mì CBOT: </w:t>
@@ -1306,7 +1306,7 @@
           <w:color w:val="5C768D"/>
           <w:sz w:val="19"/>
         </w:rPr>
-        <w:t>Cập nhật tự động lúc 06:16 ICT ngày 06/10/2026 — Nguồn: NOAA, USDA, BOM Australia</w:t>
+        <w:t>Cập nhật tự động lúc 06:34 ICT ngày 06/10/2026 — Nguồn: NOAA, USDA, BOM Australia</w:t>
       </w:r>
     </w:p>
     <w:p>
@@ -1949,7 +1949,7 @@
             </w:pPr>
             <w:r/>
             <w:r>
-              <w:t>Đông 27% gieo, Xuân N/A</w:t>
+              <w:t>Đông 36% gieo, Xuân N/A</w:t>
             </w:r>
           </w:p>
         </w:tc>
@@ -6542,7 +6542,7 @@
               <w:rPr>
                 <w:b/>
               </w:rPr>
-              <w:t>57% Good to Excellent</w:t>
+              <w:t>54% Good to Excellent</w:t>
             </w:r>
           </w:p>
         </w:tc>
@@ -6889,7 +6889,7 @@
               <w:rPr>
                 <w:b/>
               </w:rPr>
-              <w:t>Đông 27% gieo, Xuân N/A</w:t>
+              <w:t>Đông 36% gieo, Xuân N/A</w:t>
             </w:r>
           </w:p>
         </w:tc>
@@ -8649,7 +8649,7 @@
             </w:pPr>
             <w:r/>
             <w:r>
-              <w:t>Thu hoạch: Mỹ: 18% thu hoạch</w:t>
+              <w:t>Thu hoạch: Mỹ: 23% thu hoạch</w:t>
             </w:r>
           </w:p>
         </w:tc>
@@ -11990,7 +11990,7 @@
               <w:rPr>
                 <w:b/>
               </w:rPr>
-              <w:t>100.96</w:t>
+              <w:t>100.26</w:t>
             </w:r>
           </w:p>
         </w:tc>
@@ -12113,7 +12113,7 @@
               <w:rPr>
                 <w:b/>
               </w:rPr>
-              <w:t>102.22</w:t>
+              <w:t>102.10</w:t>
             </w:r>
           </w:p>
         </w:tc>
@@ -13332,7 +13332,7 @@
             </w:pPr>
             <w:r/>
             <w:r>
-              <w:t>57% Good to Excellent</w:t>
+              <w:t>54% Good to Excellent</w:t>
             </w:r>
           </w:p>
         </w:tc>
@@ -22171,7 +22171,7 @@
               <w:rPr>
                 <w:b/>
               </w:rPr>
-              <w:t>100.96</w:t>
+              <w:t>100.26</w:t>
             </w:r>
           </w:p>
         </w:tc>
@@ -22294,7 +22294,7 @@
               <w:rPr>
                 <w:b/>
               </w:rPr>
-              <w:t>102.22</w:t>
+              <w:t>102.10</w:t>
             </w:r>
           </w:p>
         </w:tc>

</xml_diff>